<commit_message>
updating and removing features related to mobile native automation and removing unused files
</commit_message>
<xml_diff>
--- a/src/documents for share/new framework/PTAF_Complete_Automation_Framework_Usage_Guide.docx
+++ b/src/documents for share/new framework/PTAF_Complete_Automation_Framework_Usage_Guide.docx
@@ -197,12 +197,6 @@
         <w:gridCol w:w="6973"/>
       </w:tblGrid>
       <w:tr>
-        <w:tblPrEx>
-          <w:tblCellMar>
-            <w:top w:w="0" w:type="dxa"/>
-            <w:bottom w:w="0" w:type="dxa"/>
-          </w:tblCellMar>
-        </w:tblPrEx>
         <w:trPr>
           <w:cantSplit/>
           <w:trHeight w:val="720"/>
@@ -250,12 +244,6 @@
         </w:tc>
       </w:tr>
       <w:tr>
-        <w:tblPrEx>
-          <w:tblCellMar>
-            <w:top w:w="0" w:type="dxa"/>
-            <w:bottom w:w="0" w:type="dxa"/>
-          </w:tblCellMar>
-        </w:tblPrEx>
         <w:trPr>
           <w:cantSplit/>
           <w:trHeight w:val="576"/>
@@ -302,12 +290,6 @@
         </w:tc>
       </w:tr>
       <w:tr>
-        <w:tblPrEx>
-          <w:tblCellMar>
-            <w:top w:w="0" w:type="dxa"/>
-            <w:bottom w:w="0" w:type="dxa"/>
-          </w:tblCellMar>
-        </w:tblPrEx>
         <w:trPr>
           <w:cantSplit/>
           <w:trHeight w:val="576"/>
@@ -354,12 +336,6 @@
         </w:tc>
       </w:tr>
       <w:tr>
-        <w:tblPrEx>
-          <w:tblCellMar>
-            <w:top w:w="0" w:type="dxa"/>
-            <w:bottom w:w="0" w:type="dxa"/>
-          </w:tblCellMar>
-        </w:tblPrEx>
         <w:trPr>
           <w:cantSplit/>
           <w:trHeight w:val="576"/>
@@ -406,12 +382,6 @@
         </w:tc>
       </w:tr>
       <w:tr>
-        <w:tblPrEx>
-          <w:tblCellMar>
-            <w:top w:w="0" w:type="dxa"/>
-            <w:bottom w:w="0" w:type="dxa"/>
-          </w:tblCellMar>
-        </w:tblPrEx>
         <w:trPr>
           <w:cantSplit/>
           <w:trHeight w:val="576"/>
@@ -458,12 +428,6 @@
         </w:tc>
       </w:tr>
       <w:tr>
-        <w:tblPrEx>
-          <w:tblCellMar>
-            <w:top w:w="0" w:type="dxa"/>
-            <w:bottom w:w="0" w:type="dxa"/>
-          </w:tblCellMar>
-        </w:tblPrEx>
         <w:trPr>
           <w:cantSplit/>
           <w:trHeight w:val="576"/>
@@ -510,12 +474,6 @@
         </w:tc>
       </w:tr>
       <w:tr>
-        <w:tblPrEx>
-          <w:tblCellMar>
-            <w:top w:w="0" w:type="dxa"/>
-            <w:bottom w:w="0" w:type="dxa"/>
-          </w:tblCellMar>
-        </w:tblPrEx>
         <w:trPr>
           <w:cantSplit/>
           <w:trHeight w:val="576"/>
@@ -611,12 +569,6 @@
         <w:gridCol w:w="4203"/>
       </w:tblGrid>
       <w:tr>
-        <w:tblPrEx>
-          <w:tblCellMar>
-            <w:top w:w="0" w:type="dxa"/>
-            <w:bottom w:w="0" w:type="dxa"/>
-          </w:tblCellMar>
-        </w:tblPrEx>
         <w:trPr>
           <w:cantSplit/>
           <w:trHeight w:val="720"/>
@@ -684,12 +636,6 @@
         </w:tc>
       </w:tr>
       <w:tr>
-        <w:tblPrEx>
-          <w:tblCellMar>
-            <w:top w:w="0" w:type="dxa"/>
-            <w:bottom w:w="0" w:type="dxa"/>
-          </w:tblCellMar>
-        </w:tblPrEx>
         <w:trPr>
           <w:cantSplit/>
           <w:trHeight w:val="576"/>
@@ -759,12 +705,6 @@
         </w:tc>
       </w:tr>
       <w:tr>
-        <w:tblPrEx>
-          <w:tblCellMar>
-            <w:top w:w="0" w:type="dxa"/>
-            <w:bottom w:w="0" w:type="dxa"/>
-          </w:tblCellMar>
-        </w:tblPrEx>
         <w:trPr>
           <w:cantSplit/>
           <w:trHeight w:val="576"/>
@@ -842,12 +782,6 @@
         </w:tc>
       </w:tr>
       <w:tr>
-        <w:tblPrEx>
-          <w:tblCellMar>
-            <w:top w:w="0" w:type="dxa"/>
-            <w:bottom w:w="0" w:type="dxa"/>
-          </w:tblCellMar>
-        </w:tblPrEx>
         <w:trPr>
           <w:cantSplit/>
           <w:trHeight w:val="576"/>
@@ -939,12 +873,6 @@
         </w:tc>
       </w:tr>
       <w:tr>
-        <w:tblPrEx>
-          <w:tblCellMar>
-            <w:top w:w="0" w:type="dxa"/>
-            <w:bottom w:w="0" w:type="dxa"/>
-          </w:tblCellMar>
-        </w:tblPrEx>
         <w:trPr>
           <w:cantSplit/>
           <w:trHeight w:val="576"/>
@@ -1022,12 +950,6 @@
         </w:tc>
       </w:tr>
       <w:tr>
-        <w:tblPrEx>
-          <w:tblCellMar>
-            <w:top w:w="0" w:type="dxa"/>
-            <w:bottom w:w="0" w:type="dxa"/>
-          </w:tblCellMar>
-        </w:tblPrEx>
         <w:trPr>
           <w:cantSplit/>
           <w:trHeight w:val="576"/>
@@ -1105,12 +1027,6 @@
         </w:tc>
       </w:tr>
       <w:tr>
-        <w:tblPrEx>
-          <w:tblCellMar>
-            <w:top w:w="0" w:type="dxa"/>
-            <w:bottom w:w="0" w:type="dxa"/>
-          </w:tblCellMar>
-        </w:tblPrEx>
         <w:trPr>
           <w:cantSplit/>
           <w:trHeight w:val="576"/>
@@ -1202,12 +1118,6 @@
         </w:tc>
       </w:tr>
       <w:tr>
-        <w:tblPrEx>
-          <w:tblCellMar>
-            <w:top w:w="0" w:type="dxa"/>
-            <w:bottom w:w="0" w:type="dxa"/>
-          </w:tblCellMar>
-        </w:tblPrEx>
         <w:trPr>
           <w:cantSplit/>
           <w:trHeight w:val="576"/>
@@ -1420,12 +1330,6 @@
         <w:gridCol w:w="5475"/>
       </w:tblGrid>
       <w:tr>
-        <w:tblPrEx>
-          <w:tblCellMar>
-            <w:top w:w="0" w:type="dxa"/>
-            <w:bottom w:w="0" w:type="dxa"/>
-          </w:tblCellMar>
-        </w:tblPrEx>
         <w:trPr>
           <w:cantSplit/>
           <w:trHeight w:val="720"/>
@@ -1473,12 +1377,6 @@
         </w:tc>
       </w:tr>
       <w:tr>
-        <w:tblPrEx>
-          <w:tblCellMar>
-            <w:top w:w="0" w:type="dxa"/>
-            <w:bottom w:w="0" w:type="dxa"/>
-          </w:tblCellMar>
-        </w:tblPrEx>
         <w:trPr>
           <w:cantSplit/>
           <w:trHeight w:val="576"/>
@@ -1558,12 +1456,6 @@
         </w:tc>
       </w:tr>
       <w:tr>
-        <w:tblPrEx>
-          <w:tblCellMar>
-            <w:top w:w="0" w:type="dxa"/>
-            <w:bottom w:w="0" w:type="dxa"/>
-          </w:tblCellMar>
-        </w:tblPrEx>
         <w:trPr>
           <w:cantSplit/>
           <w:trHeight w:val="576"/>
@@ -1643,12 +1535,6 @@
         </w:tc>
       </w:tr>
       <w:tr>
-        <w:tblPrEx>
-          <w:tblCellMar>
-            <w:top w:w="0" w:type="dxa"/>
-            <w:bottom w:w="0" w:type="dxa"/>
-          </w:tblCellMar>
-        </w:tblPrEx>
         <w:trPr>
           <w:cantSplit/>
           <w:trHeight w:val="576"/>
@@ -1728,12 +1614,6 @@
         </w:tc>
       </w:tr>
       <w:tr>
-        <w:tblPrEx>
-          <w:tblCellMar>
-            <w:top w:w="0" w:type="dxa"/>
-            <w:bottom w:w="0" w:type="dxa"/>
-          </w:tblCellMar>
-        </w:tblPrEx>
         <w:trPr>
           <w:cantSplit/>
           <w:trHeight w:val="576"/>
@@ -1806,12 +1686,6 @@
         </w:tc>
       </w:tr>
       <w:tr>
-        <w:tblPrEx>
-          <w:tblCellMar>
-            <w:top w:w="0" w:type="dxa"/>
-            <w:bottom w:w="0" w:type="dxa"/>
-          </w:tblCellMar>
-        </w:tblPrEx>
         <w:trPr>
           <w:cantSplit/>
           <w:trHeight w:val="576"/>
@@ -1883,12 +1757,6 @@
         </w:tc>
       </w:tr>
       <w:tr>
-        <w:tblPrEx>
-          <w:tblCellMar>
-            <w:top w:w="0" w:type="dxa"/>
-            <w:bottom w:w="0" w:type="dxa"/>
-          </w:tblCellMar>
-        </w:tblPrEx>
         <w:trPr>
           <w:cantSplit/>
           <w:trHeight w:val="576"/>
@@ -1960,12 +1828,6 @@
         </w:tc>
       </w:tr>
       <w:tr>
-        <w:tblPrEx>
-          <w:tblCellMar>
-            <w:top w:w="0" w:type="dxa"/>
-            <w:bottom w:w="0" w:type="dxa"/>
-          </w:tblCellMar>
-        </w:tblPrEx>
         <w:trPr>
           <w:cantSplit/>
           <w:trHeight w:val="576"/>
@@ -2059,12 +1921,6 @@
         </w:tc>
       </w:tr>
       <w:tr>
-        <w:tblPrEx>
-          <w:tblCellMar>
-            <w:top w:w="0" w:type="dxa"/>
-            <w:bottom w:w="0" w:type="dxa"/>
-          </w:tblCellMar>
-        </w:tblPrEx>
         <w:trPr>
           <w:cantSplit/>
           <w:trHeight w:val="576"/>
@@ -2136,12 +1992,6 @@
         </w:tc>
       </w:tr>
       <w:tr>
-        <w:tblPrEx>
-          <w:tblCellMar>
-            <w:top w:w="0" w:type="dxa"/>
-            <w:bottom w:w="0" w:type="dxa"/>
-          </w:tblCellMar>
-        </w:tblPrEx>
         <w:trPr>
           <w:cantSplit/>
           <w:trHeight w:val="576"/>
@@ -2213,12 +2063,6 @@
         </w:tc>
       </w:tr>
       <w:tr>
-        <w:tblPrEx>
-          <w:tblCellMar>
-            <w:top w:w="0" w:type="dxa"/>
-            <w:bottom w:w="0" w:type="dxa"/>
-          </w:tblCellMar>
-        </w:tblPrEx>
         <w:trPr>
           <w:cantSplit/>
           <w:trHeight w:val="576"/>
@@ -2298,12 +2142,6 @@
         </w:tc>
       </w:tr>
       <w:tr>
-        <w:tblPrEx>
-          <w:tblCellMar>
-            <w:top w:w="0" w:type="dxa"/>
-            <w:bottom w:w="0" w:type="dxa"/>
-          </w:tblCellMar>
-        </w:tblPrEx>
         <w:trPr>
           <w:cantSplit/>
           <w:trHeight w:val="576"/>
@@ -2361,12 +2199,6 @@
         </w:tc>
       </w:tr>
       <w:tr>
-        <w:tblPrEx>
-          <w:tblCellMar>
-            <w:top w:w="0" w:type="dxa"/>
-            <w:bottom w:w="0" w:type="dxa"/>
-          </w:tblCellMar>
-        </w:tblPrEx>
         <w:trPr>
           <w:cantSplit/>
           <w:trHeight w:val="576"/>
@@ -2424,12 +2256,6 @@
         </w:tc>
       </w:tr>
       <w:tr>
-        <w:tblPrEx>
-          <w:tblCellMar>
-            <w:top w:w="0" w:type="dxa"/>
-            <w:bottom w:w="0" w:type="dxa"/>
-          </w:tblCellMar>
-        </w:tblPrEx>
         <w:trPr>
           <w:cantSplit/>
           <w:trHeight w:val="576"/>
@@ -2487,12 +2313,6 @@
         </w:tc>
       </w:tr>
       <w:tr>
-        <w:tblPrEx>
-          <w:tblCellMar>
-            <w:top w:w="0" w:type="dxa"/>
-            <w:bottom w:w="0" w:type="dxa"/>
-          </w:tblCellMar>
-        </w:tblPrEx>
         <w:trPr>
           <w:cantSplit/>
           <w:trHeight w:val="576"/>
@@ -2558,12 +2378,6 @@
         </w:tc>
       </w:tr>
       <w:tr>
-        <w:tblPrEx>
-          <w:tblCellMar>
-            <w:top w:w="0" w:type="dxa"/>
-            <w:bottom w:w="0" w:type="dxa"/>
-          </w:tblCellMar>
-        </w:tblPrEx>
         <w:trPr>
           <w:cantSplit/>
           <w:trHeight w:val="576"/>
@@ -2621,12 +2435,6 @@
         </w:tc>
       </w:tr>
       <w:tr>
-        <w:tblPrEx>
-          <w:tblCellMar>
-            <w:top w:w="0" w:type="dxa"/>
-            <w:bottom w:w="0" w:type="dxa"/>
-          </w:tblCellMar>
-        </w:tblPrEx>
         <w:trPr>
           <w:cantSplit/>
           <w:trHeight w:val="576"/>
@@ -2797,12 +2605,6 @@
         <w:gridCol w:w="6705"/>
       </w:tblGrid>
       <w:tr>
-        <w:tblPrEx>
-          <w:tblCellMar>
-            <w:top w:w="0" w:type="dxa"/>
-            <w:bottom w:w="0" w:type="dxa"/>
-          </w:tblCellMar>
-        </w:tblPrEx>
         <w:trPr>
           <w:cantSplit/>
           <w:trHeight w:val="720"/>
@@ -2850,12 +2652,6 @@
         </w:tc>
       </w:tr>
       <w:tr>
-        <w:tblPrEx>
-          <w:tblCellMar>
-            <w:top w:w="0" w:type="dxa"/>
-            <w:bottom w:w="0" w:type="dxa"/>
-          </w:tblCellMar>
-        </w:tblPrEx>
         <w:trPr>
           <w:cantSplit/>
           <w:trHeight w:val="576"/>
@@ -2905,12 +2701,6 @@
         </w:tc>
       </w:tr>
       <w:tr>
-        <w:tblPrEx>
-          <w:tblCellMar>
-            <w:top w:w="0" w:type="dxa"/>
-            <w:bottom w:w="0" w:type="dxa"/>
-          </w:tblCellMar>
-        </w:tblPrEx>
         <w:trPr>
           <w:cantSplit/>
           <w:trHeight w:val="576"/>
@@ -2960,12 +2750,6 @@
         </w:tc>
       </w:tr>
       <w:tr>
-        <w:tblPrEx>
-          <w:tblCellMar>
-            <w:top w:w="0" w:type="dxa"/>
-            <w:bottom w:w="0" w:type="dxa"/>
-          </w:tblCellMar>
-        </w:tblPrEx>
         <w:trPr>
           <w:cantSplit/>
           <w:trHeight w:val="576"/>
@@ -3022,12 +2806,6 @@
         </w:tc>
       </w:tr>
       <w:tr>
-        <w:tblPrEx>
-          <w:tblCellMar>
-            <w:top w:w="0" w:type="dxa"/>
-            <w:bottom w:w="0" w:type="dxa"/>
-          </w:tblCellMar>
-        </w:tblPrEx>
         <w:trPr>
           <w:cantSplit/>
           <w:trHeight w:val="576"/>
@@ -3079,12 +2857,6 @@
         </w:tc>
       </w:tr>
       <w:tr>
-        <w:tblPrEx>
-          <w:tblCellMar>
-            <w:top w:w="0" w:type="dxa"/>
-            <w:bottom w:w="0" w:type="dxa"/>
-          </w:tblCellMar>
-        </w:tblPrEx>
         <w:trPr>
           <w:cantSplit/>
           <w:trHeight w:val="576"/>
@@ -3136,12 +2908,6 @@
         </w:tc>
       </w:tr>
       <w:tr>
-        <w:tblPrEx>
-          <w:tblCellMar>
-            <w:top w:w="0" w:type="dxa"/>
-            <w:bottom w:w="0" w:type="dxa"/>
-          </w:tblCellMar>
-        </w:tblPrEx>
         <w:trPr>
           <w:cantSplit/>
           <w:trHeight w:val="576"/>
@@ -3191,12 +2957,6 @@
         </w:tc>
       </w:tr>
       <w:tr>
-        <w:tblPrEx>
-          <w:tblCellMar>
-            <w:top w:w="0" w:type="dxa"/>
-            <w:bottom w:w="0" w:type="dxa"/>
-          </w:tblCellMar>
-        </w:tblPrEx>
         <w:trPr>
           <w:cantSplit/>
           <w:trHeight w:val="576"/>
@@ -3577,12 +3337,6 @@
         <w:gridCol w:w="6745"/>
       </w:tblGrid>
       <w:tr>
-        <w:tblPrEx>
-          <w:tblCellMar>
-            <w:top w:w="0" w:type="dxa"/>
-            <w:bottom w:w="0" w:type="dxa"/>
-          </w:tblCellMar>
-        </w:tblPrEx>
         <w:trPr>
           <w:cantSplit/>
           <w:trHeight w:val="720"/>
@@ -3630,12 +3384,6 @@
         </w:tc>
       </w:tr>
       <w:tr>
-        <w:tblPrEx>
-          <w:tblCellMar>
-            <w:top w:w="0" w:type="dxa"/>
-            <w:bottom w:w="0" w:type="dxa"/>
-          </w:tblCellMar>
-        </w:tblPrEx>
         <w:trPr>
           <w:cantSplit/>
           <w:trHeight w:val="576"/>
@@ -3682,12 +3430,6 @@
         </w:tc>
       </w:tr>
       <w:tr>
-        <w:tblPrEx>
-          <w:tblCellMar>
-            <w:top w:w="0" w:type="dxa"/>
-            <w:bottom w:w="0" w:type="dxa"/>
-          </w:tblCellMar>
-        </w:tblPrEx>
         <w:trPr>
           <w:cantSplit/>
           <w:trHeight w:val="576"/>
@@ -3734,12 +3476,6 @@
         </w:tc>
       </w:tr>
       <w:tr>
-        <w:tblPrEx>
-          <w:tblCellMar>
-            <w:top w:w="0" w:type="dxa"/>
-            <w:bottom w:w="0" w:type="dxa"/>
-          </w:tblCellMar>
-        </w:tblPrEx>
         <w:trPr>
           <w:cantSplit/>
           <w:trHeight w:val="576"/>
@@ -3786,12 +3522,6 @@
         </w:tc>
       </w:tr>
       <w:tr>
-        <w:tblPrEx>
-          <w:tblCellMar>
-            <w:top w:w="0" w:type="dxa"/>
-            <w:bottom w:w="0" w:type="dxa"/>
-          </w:tblCellMar>
-        </w:tblPrEx>
         <w:trPr>
           <w:cantSplit/>
           <w:trHeight w:val="576"/>
@@ -3838,12 +3568,6 @@
         </w:tc>
       </w:tr>
       <w:tr>
-        <w:tblPrEx>
-          <w:tblCellMar>
-            <w:top w:w="0" w:type="dxa"/>
-            <w:bottom w:w="0" w:type="dxa"/>
-          </w:tblCellMar>
-        </w:tblPrEx>
         <w:trPr>
           <w:cantSplit/>
           <w:trHeight w:val="576"/>
@@ -3890,12 +3614,6 @@
         </w:tc>
       </w:tr>
       <w:tr>
-        <w:tblPrEx>
-          <w:tblCellMar>
-            <w:top w:w="0" w:type="dxa"/>
-            <w:bottom w:w="0" w:type="dxa"/>
-          </w:tblCellMar>
-        </w:tblPrEx>
         <w:trPr>
           <w:cantSplit/>
           <w:trHeight w:val="576"/>
@@ -4435,12 +4153,6 @@
         <w:gridCol w:w="6643"/>
       </w:tblGrid>
       <w:tr>
-        <w:tblPrEx>
-          <w:tblCellMar>
-            <w:top w:w="0" w:type="dxa"/>
-            <w:bottom w:w="0" w:type="dxa"/>
-          </w:tblCellMar>
-        </w:tblPrEx>
         <w:trPr>
           <w:cantSplit/>
           <w:trHeight w:val="720"/>
@@ -4488,12 +4200,6 @@
         </w:tc>
       </w:tr>
       <w:tr>
-        <w:tblPrEx>
-          <w:tblCellMar>
-            <w:top w:w="0" w:type="dxa"/>
-            <w:bottom w:w="0" w:type="dxa"/>
-          </w:tblCellMar>
-        </w:tblPrEx>
         <w:trPr>
           <w:cantSplit/>
           <w:trHeight w:val="576"/>
@@ -4551,12 +4257,6 @@
         </w:tc>
       </w:tr>
       <w:tr>
-        <w:tblPrEx>
-          <w:tblCellMar>
-            <w:top w:w="0" w:type="dxa"/>
-            <w:bottom w:w="0" w:type="dxa"/>
-          </w:tblCellMar>
-        </w:tblPrEx>
         <w:trPr>
           <w:cantSplit/>
           <w:trHeight w:val="576"/>
@@ -4603,12 +4303,6 @@
         </w:tc>
       </w:tr>
       <w:tr>
-        <w:tblPrEx>
-          <w:tblCellMar>
-            <w:top w:w="0" w:type="dxa"/>
-            <w:bottom w:w="0" w:type="dxa"/>
-          </w:tblCellMar>
-        </w:tblPrEx>
         <w:trPr>
           <w:cantSplit/>
           <w:trHeight w:val="576"/>
@@ -4655,12 +4349,6 @@
         </w:tc>
       </w:tr>
       <w:tr>
-        <w:tblPrEx>
-          <w:tblCellMar>
-            <w:top w:w="0" w:type="dxa"/>
-            <w:bottom w:w="0" w:type="dxa"/>
-          </w:tblCellMar>
-        </w:tblPrEx>
         <w:trPr>
           <w:cantSplit/>
           <w:trHeight w:val="576"/>
@@ -4707,12 +4395,6 @@
         </w:tc>
       </w:tr>
       <w:tr>
-        <w:tblPrEx>
-          <w:tblCellMar>
-            <w:top w:w="0" w:type="dxa"/>
-            <w:bottom w:w="0" w:type="dxa"/>
-          </w:tblCellMar>
-        </w:tblPrEx>
         <w:trPr>
           <w:cantSplit/>
           <w:trHeight w:val="576"/>
@@ -5190,12 +4872,6 @@
         <w:gridCol w:w="6156"/>
       </w:tblGrid>
       <w:tr>
-        <w:tblPrEx>
-          <w:tblCellMar>
-            <w:top w:w="0" w:type="dxa"/>
-            <w:bottom w:w="0" w:type="dxa"/>
-          </w:tblCellMar>
-        </w:tblPrEx>
         <w:trPr>
           <w:cantSplit/>
           <w:trHeight w:val="720"/>
@@ -5243,12 +4919,6 @@
         </w:tc>
       </w:tr>
       <w:tr>
-        <w:tblPrEx>
-          <w:tblCellMar>
-            <w:top w:w="0" w:type="dxa"/>
-            <w:bottom w:w="0" w:type="dxa"/>
-          </w:tblCellMar>
-        </w:tblPrEx>
         <w:trPr>
           <w:cantSplit/>
           <w:trHeight w:val="576"/>
@@ -5295,12 +4965,6 @@
         </w:tc>
       </w:tr>
       <w:tr>
-        <w:tblPrEx>
-          <w:tblCellMar>
-            <w:top w:w="0" w:type="dxa"/>
-            <w:bottom w:w="0" w:type="dxa"/>
-          </w:tblCellMar>
-        </w:tblPrEx>
         <w:trPr>
           <w:cantSplit/>
           <w:trHeight w:val="576"/>
@@ -5347,12 +5011,6 @@
         </w:tc>
       </w:tr>
       <w:tr>
-        <w:tblPrEx>
-          <w:tblCellMar>
-            <w:top w:w="0" w:type="dxa"/>
-            <w:bottom w:w="0" w:type="dxa"/>
-          </w:tblCellMar>
-        </w:tblPrEx>
         <w:trPr>
           <w:cantSplit/>
           <w:trHeight w:val="576"/>
@@ -5399,12 +5057,6 @@
         </w:tc>
       </w:tr>
       <w:tr>
-        <w:tblPrEx>
-          <w:tblCellMar>
-            <w:top w:w="0" w:type="dxa"/>
-            <w:bottom w:w="0" w:type="dxa"/>
-          </w:tblCellMar>
-        </w:tblPrEx>
         <w:trPr>
           <w:cantSplit/>
           <w:trHeight w:val="576"/>
@@ -5451,12 +5103,6 @@
         </w:tc>
       </w:tr>
       <w:tr>
-        <w:tblPrEx>
-          <w:tblCellMar>
-            <w:top w:w="0" w:type="dxa"/>
-            <w:bottom w:w="0" w:type="dxa"/>
-          </w:tblCellMar>
-        </w:tblPrEx>
         <w:trPr>
           <w:cantSplit/>
           <w:trHeight w:val="576"/>
@@ -5503,12 +5149,6 @@
         </w:tc>
       </w:tr>
       <w:tr>
-        <w:tblPrEx>
-          <w:tblCellMar>
-            <w:top w:w="0" w:type="dxa"/>
-            <w:bottom w:w="0" w:type="dxa"/>
-          </w:tblCellMar>
-        </w:tblPrEx>
         <w:trPr>
           <w:cantSplit/>
           <w:trHeight w:val="576"/>
@@ -6174,12 +5814,6 @@
         <w:gridCol w:w="6526"/>
       </w:tblGrid>
       <w:tr>
-        <w:tblPrEx>
-          <w:tblCellMar>
-            <w:top w:w="0" w:type="dxa"/>
-            <w:bottom w:w="0" w:type="dxa"/>
-          </w:tblCellMar>
-        </w:tblPrEx>
         <w:trPr>
           <w:cantSplit/>
           <w:trHeight w:val="720"/>
@@ -6227,12 +5861,6 @@
         </w:tc>
       </w:tr>
       <w:tr>
-        <w:tblPrEx>
-          <w:tblCellMar>
-            <w:top w:w="0" w:type="dxa"/>
-            <w:bottom w:w="0" w:type="dxa"/>
-          </w:tblCellMar>
-        </w:tblPrEx>
         <w:trPr>
           <w:cantSplit/>
           <w:trHeight w:val="576"/>
@@ -6279,12 +5907,6 @@
         </w:tc>
       </w:tr>
       <w:tr>
-        <w:tblPrEx>
-          <w:tblCellMar>
-            <w:top w:w="0" w:type="dxa"/>
-            <w:bottom w:w="0" w:type="dxa"/>
-          </w:tblCellMar>
-        </w:tblPrEx>
         <w:trPr>
           <w:cantSplit/>
           <w:trHeight w:val="576"/>
@@ -6331,12 +5953,6 @@
         </w:tc>
       </w:tr>
       <w:tr>
-        <w:tblPrEx>
-          <w:tblCellMar>
-            <w:top w:w="0" w:type="dxa"/>
-            <w:bottom w:w="0" w:type="dxa"/>
-          </w:tblCellMar>
-        </w:tblPrEx>
         <w:trPr>
           <w:cantSplit/>
           <w:trHeight w:val="576"/>
@@ -6383,12 +5999,6 @@
         </w:tc>
       </w:tr>
       <w:tr>
-        <w:tblPrEx>
-          <w:tblCellMar>
-            <w:top w:w="0" w:type="dxa"/>
-            <w:bottom w:w="0" w:type="dxa"/>
-          </w:tblCellMar>
-        </w:tblPrEx>
         <w:trPr>
           <w:cantSplit/>
           <w:trHeight w:val="576"/>
@@ -6435,12 +6045,6 @@
         </w:tc>
       </w:tr>
       <w:tr>
-        <w:tblPrEx>
-          <w:tblCellMar>
-            <w:top w:w="0" w:type="dxa"/>
-            <w:bottom w:w="0" w:type="dxa"/>
-          </w:tblCellMar>
-        </w:tblPrEx>
         <w:trPr>
           <w:cantSplit/>
           <w:trHeight w:val="576"/>
@@ -6487,12 +6091,6 @@
         </w:tc>
       </w:tr>
       <w:tr>
-        <w:tblPrEx>
-          <w:tblCellMar>
-            <w:top w:w="0" w:type="dxa"/>
-            <w:bottom w:w="0" w:type="dxa"/>
-          </w:tblCellMar>
-        </w:tblPrEx>
         <w:trPr>
           <w:cantSplit/>
           <w:trHeight w:val="576"/>
@@ -7050,12 +6648,6 @@
         <w:gridCol w:w="6278"/>
       </w:tblGrid>
       <w:tr>
-        <w:tblPrEx>
-          <w:tblCellMar>
-            <w:top w:w="0" w:type="dxa"/>
-            <w:bottom w:w="0" w:type="dxa"/>
-          </w:tblCellMar>
-        </w:tblPrEx>
         <w:trPr>
           <w:cantSplit/>
           <w:trHeight w:val="720"/>
@@ -7103,12 +6695,6 @@
         </w:tc>
       </w:tr>
       <w:tr>
-        <w:tblPrEx>
-          <w:tblCellMar>
-            <w:top w:w="0" w:type="dxa"/>
-            <w:bottom w:w="0" w:type="dxa"/>
-          </w:tblCellMar>
-        </w:tblPrEx>
         <w:trPr>
           <w:cantSplit/>
           <w:trHeight w:val="576"/>
@@ -7168,12 +6754,6 @@
         </w:tc>
       </w:tr>
       <w:tr>
-        <w:tblPrEx>
-          <w:tblCellMar>
-            <w:top w:w="0" w:type="dxa"/>
-            <w:bottom w:w="0" w:type="dxa"/>
-          </w:tblCellMar>
-        </w:tblPrEx>
         <w:trPr>
           <w:cantSplit/>
           <w:trHeight w:val="576"/>
@@ -7225,12 +6805,6 @@
         </w:tc>
       </w:tr>
       <w:tr>
-        <w:tblPrEx>
-          <w:tblCellMar>
-            <w:top w:w="0" w:type="dxa"/>
-            <w:bottom w:w="0" w:type="dxa"/>
-          </w:tblCellMar>
-        </w:tblPrEx>
         <w:trPr>
           <w:cantSplit/>
           <w:trHeight w:val="576"/>
@@ -7284,12 +6858,6 @@
         </w:tc>
       </w:tr>
       <w:tr>
-        <w:tblPrEx>
-          <w:tblCellMar>
-            <w:top w:w="0" w:type="dxa"/>
-            <w:bottom w:w="0" w:type="dxa"/>
-          </w:tblCellMar>
-        </w:tblPrEx>
         <w:trPr>
           <w:cantSplit/>
           <w:trHeight w:val="576"/>
@@ -7343,12 +6911,6 @@
         </w:tc>
       </w:tr>
       <w:tr>
-        <w:tblPrEx>
-          <w:tblCellMar>
-            <w:top w:w="0" w:type="dxa"/>
-            <w:bottom w:w="0" w:type="dxa"/>
-          </w:tblCellMar>
-        </w:tblPrEx>
         <w:trPr>
           <w:cantSplit/>
           <w:trHeight w:val="576"/>
@@ -7685,12 +7247,6 @@
         <w:gridCol w:w="6324"/>
       </w:tblGrid>
       <w:tr>
-        <w:tblPrEx>
-          <w:tblCellMar>
-            <w:top w:w="0" w:type="dxa"/>
-            <w:bottom w:w="0" w:type="dxa"/>
-          </w:tblCellMar>
-        </w:tblPrEx>
         <w:trPr>
           <w:cantSplit/>
           <w:trHeight w:val="720"/>
@@ -7738,12 +7294,6 @@
         </w:tc>
       </w:tr>
       <w:tr>
-        <w:tblPrEx>
-          <w:tblCellMar>
-            <w:top w:w="0" w:type="dxa"/>
-            <w:bottom w:w="0" w:type="dxa"/>
-          </w:tblCellMar>
-        </w:tblPrEx>
         <w:trPr>
           <w:cantSplit/>
           <w:trHeight w:val="576"/>
@@ -7809,12 +7359,6 @@
         </w:tc>
       </w:tr>
       <w:tr>
-        <w:tblPrEx>
-          <w:tblCellMar>
-            <w:top w:w="0" w:type="dxa"/>
-            <w:bottom w:w="0" w:type="dxa"/>
-          </w:tblCellMar>
-        </w:tblPrEx>
         <w:trPr>
           <w:cantSplit/>
           <w:trHeight w:val="576"/>
@@ -7872,12 +7416,6 @@
         </w:tc>
       </w:tr>
       <w:tr>
-        <w:tblPrEx>
-          <w:tblCellMar>
-            <w:top w:w="0" w:type="dxa"/>
-            <w:bottom w:w="0" w:type="dxa"/>
-          </w:tblCellMar>
-        </w:tblPrEx>
         <w:trPr>
           <w:cantSplit/>
           <w:trHeight w:val="576"/>
@@ -8087,25 +7625,7 @@
         <w:rPr>
           <w:color w:val="000000" w:themeColor="text1"/>
         </w:rPr>
-        <w:t xml:space="preserve">for </w:t>
-      </w:r>
-      <w:r>
-        <w:rPr>
-          <w:color w:val="000000" w:themeColor="text1"/>
-        </w:rPr>
-        <w:t>local</w:t>
-      </w:r>
-      <w:r>
-        <w:rPr>
-          <w:color w:val="000000" w:themeColor="text1"/>
-        </w:rPr>
-        <w:t xml:space="preserve"> instal</w:t>
-      </w:r>
-      <w:r>
-        <w:rPr>
-          <w:color w:val="000000" w:themeColor="text1"/>
-        </w:rPr>
-        <w:t>l</w:t>
+        <w:t>for local install</w:t>
       </w:r>
     </w:p>
     <w:p>
@@ -8280,8 +7800,12 @@
           <w:right w:val="single" w:sz="1" w:space="8" w:color="E1E4E8"/>
         </w:pBdr>
         <w:shd w:val="clear" w:color="auto" w:fill="F6F8FA"/>
-        <w:spacing w:before="0" w:after="120" w:line="276" w:lineRule="auto"/>
+        <w:spacing w:after="120" w:line="276" w:lineRule="auto"/>
         <w:ind w:left="360"/>
+        <w:rPr>
+          <w:rFonts w:ascii="Cascadia Code, Consolas, Courie" w:eastAsia="Cascadia Code, Consolas, Courie" w:hAnsi="Cascadia Code, Consolas, Courie" w:cs="Cascadia Code, Consolas, Courie"/>
+          <w:color w:val="6F42C1"/>
+        </w:rPr>
       </w:pPr>
       <w:proofErr w:type="spellStart"/>
       <w:r>
@@ -8294,6 +7818,40 @@
         <w:t>appium</w:t>
       </w:r>
       <w:proofErr w:type="spellEnd"/>
+      <w:r>
+        <w:rPr>
+          <w:rFonts w:ascii="Cascadia Code, Consolas, Courie" w:eastAsia="Cascadia Code, Consolas, Courie" w:hAnsi="Cascadia Code, Consolas, Courie" w:cs="Cascadia Code, Consolas, Courie"/>
+          <w:color w:val="6F42C1"/>
+          <w:sz w:val="20"/>
+          <w:szCs w:val="20"/>
+        </w:rPr>
+        <w:t xml:space="preserve">, </w:t>
+      </w:r>
+      <w:r>
+        <w:rPr>
+          <w:rFonts w:ascii="Cascadia Code, Consolas, Courie" w:eastAsia="Cascadia Code, Consolas, Courie" w:hAnsi="Cascadia Code, Consolas, Courie" w:cs="Cascadia Code, Consolas, Courie"/>
+          <w:color w:val="auto"/>
+          <w:sz w:val="20"/>
+          <w:szCs w:val="20"/>
+        </w:rPr>
+        <w:t xml:space="preserve">for Mobile native Browser: </w:t>
+      </w:r>
+      <w:proofErr w:type="spellStart"/>
+      <w:r>
+        <w:rPr>
+          <w:rFonts w:ascii="Cascadia Code, Consolas, Courie" w:eastAsia="Cascadia Code, Consolas, Courie" w:hAnsi="Cascadia Code, Consolas, Courie" w:cs="Cascadia Code, Consolas, Courie"/>
+          <w:color w:val="6F42C1"/>
+        </w:rPr>
+        <w:t>appium</w:t>
+      </w:r>
+      <w:proofErr w:type="spellEnd"/>
+      <w:r>
+        <w:rPr>
+          <w:rFonts w:ascii="Cascadia Code, Consolas, Courie" w:eastAsia="Cascadia Code, Consolas, Courie" w:hAnsi="Cascadia Code, Consolas, Courie" w:cs="Cascadia Code, Consolas, Courie"/>
+          <w:color w:val="6F42C1"/>
+        </w:rPr>
+        <w:t xml:space="preserve"> --relaxed-security</w:t>
+      </w:r>
     </w:p>
     <w:p>
       <w:pPr>
@@ -8825,12 +8383,6 @@
         <w:gridCol w:w="7258"/>
       </w:tblGrid>
       <w:tr>
-        <w:tblPrEx>
-          <w:tblCellMar>
-            <w:top w:w="0" w:type="dxa"/>
-            <w:bottom w:w="0" w:type="dxa"/>
-          </w:tblCellMar>
-        </w:tblPrEx>
         <w:trPr>
           <w:cantSplit/>
           <w:trHeight w:val="720"/>
@@ -8878,12 +8430,6 @@
         </w:tc>
       </w:tr>
       <w:tr>
-        <w:tblPrEx>
-          <w:tblCellMar>
-            <w:top w:w="0" w:type="dxa"/>
-            <w:bottom w:w="0" w:type="dxa"/>
-          </w:tblCellMar>
-        </w:tblPrEx>
         <w:trPr>
           <w:cantSplit/>
           <w:trHeight w:val="576"/>
@@ -8957,12 +8503,6 @@
         </w:tc>
       </w:tr>
       <w:tr>
-        <w:tblPrEx>
-          <w:tblCellMar>
-            <w:top w:w="0" w:type="dxa"/>
-            <w:bottom w:w="0" w:type="dxa"/>
-          </w:tblCellMar>
-        </w:tblPrEx>
         <w:trPr>
           <w:cantSplit/>
           <w:trHeight w:val="576"/>
@@ -9042,12 +8582,6 @@
         </w:tc>
       </w:tr>
       <w:tr>
-        <w:tblPrEx>
-          <w:tblCellMar>
-            <w:top w:w="0" w:type="dxa"/>
-            <w:bottom w:w="0" w:type="dxa"/>
-          </w:tblCellMar>
-        </w:tblPrEx>
         <w:trPr>
           <w:cantSplit/>
           <w:trHeight w:val="576"/>
@@ -9121,12 +8655,6 @@
         </w:tc>
       </w:tr>
       <w:tr>
-        <w:tblPrEx>
-          <w:tblCellMar>
-            <w:top w:w="0" w:type="dxa"/>
-            <w:bottom w:w="0" w:type="dxa"/>
-          </w:tblCellMar>
-        </w:tblPrEx>
         <w:trPr>
           <w:cantSplit/>
           <w:trHeight w:val="576"/>
@@ -9176,12 +8704,6 @@
         </w:tc>
       </w:tr>
       <w:tr>
-        <w:tblPrEx>
-          <w:tblCellMar>
-            <w:top w:w="0" w:type="dxa"/>
-            <w:bottom w:w="0" w:type="dxa"/>
-          </w:tblCellMar>
-        </w:tblPrEx>
         <w:trPr>
           <w:cantSplit/>
           <w:trHeight w:val="576"/>
@@ -9239,12 +8761,6 @@
         </w:tc>
       </w:tr>
       <w:tr>
-        <w:tblPrEx>
-          <w:tblCellMar>
-            <w:top w:w="0" w:type="dxa"/>
-            <w:bottom w:w="0" w:type="dxa"/>
-          </w:tblCellMar>
-        </w:tblPrEx>
         <w:trPr>
           <w:cantSplit/>
           <w:trHeight w:val="576"/>
@@ -9294,12 +8810,6 @@
         </w:tc>
       </w:tr>
       <w:tr>
-        <w:tblPrEx>
-          <w:tblCellMar>
-            <w:top w:w="0" w:type="dxa"/>
-            <w:bottom w:w="0" w:type="dxa"/>
-          </w:tblCellMar>
-        </w:tblPrEx>
         <w:trPr>
           <w:cantSplit/>
           <w:trHeight w:val="576"/>
@@ -9379,12 +8889,6 @@
         </w:tc>
       </w:tr>
       <w:tr>
-        <w:tblPrEx>
-          <w:tblCellMar>
-            <w:top w:w="0" w:type="dxa"/>
-            <w:bottom w:w="0" w:type="dxa"/>
-          </w:tblCellMar>
-        </w:tblPrEx>
         <w:trPr>
           <w:cantSplit/>
           <w:trHeight w:val="576"/>
@@ -9448,12 +8952,6 @@
         </w:tc>
       </w:tr>
       <w:tr>
-        <w:tblPrEx>
-          <w:tblCellMar>
-            <w:top w:w="0" w:type="dxa"/>
-            <w:bottom w:w="0" w:type="dxa"/>
-          </w:tblCellMar>
-        </w:tblPrEx>
         <w:trPr>
           <w:cantSplit/>
           <w:trHeight w:val="576"/>
@@ -9512,12 +9010,6 @@
         </w:tc>
       </w:tr>
       <w:tr>
-        <w:tblPrEx>
-          <w:tblCellMar>
-            <w:top w:w="0" w:type="dxa"/>
-            <w:bottom w:w="0" w:type="dxa"/>
-          </w:tblCellMar>
-        </w:tblPrEx>
         <w:trPr>
           <w:cantSplit/>
           <w:trHeight w:val="576"/>
@@ -9568,12 +9060,6 @@
         </w:tc>
       </w:tr>
       <w:tr>
-        <w:tblPrEx>
-          <w:tblCellMar>
-            <w:top w:w="0" w:type="dxa"/>
-            <w:bottom w:w="0" w:type="dxa"/>
-          </w:tblCellMar>
-        </w:tblPrEx>
         <w:trPr>
           <w:cantSplit/>
           <w:trHeight w:val="576"/>
@@ -9623,12 +9109,6 @@
         </w:tc>
       </w:tr>
       <w:tr>
-        <w:tblPrEx>
-          <w:tblCellMar>
-            <w:top w:w="0" w:type="dxa"/>
-            <w:bottom w:w="0" w:type="dxa"/>
-          </w:tblCellMar>
-        </w:tblPrEx>
         <w:trPr>
           <w:cantSplit/>
           <w:trHeight w:val="576"/>
@@ -9692,12 +9172,6 @@
         </w:tc>
       </w:tr>
       <w:tr>
-        <w:tblPrEx>
-          <w:tblCellMar>
-            <w:top w:w="0" w:type="dxa"/>
-            <w:bottom w:w="0" w:type="dxa"/>
-          </w:tblCellMar>
-        </w:tblPrEx>
         <w:trPr>
           <w:cantSplit/>
           <w:trHeight w:val="576"/>
@@ -9775,12 +9249,6 @@
         </w:tc>
       </w:tr>
       <w:tr>
-        <w:tblPrEx>
-          <w:tblCellMar>
-            <w:top w:w="0" w:type="dxa"/>
-            <w:bottom w:w="0" w:type="dxa"/>
-          </w:tblCellMar>
-        </w:tblPrEx>
         <w:trPr>
           <w:cantSplit/>
           <w:trHeight w:val="576"/>
@@ -9830,12 +9298,6 @@
         </w:tc>
       </w:tr>
       <w:tr>
-        <w:tblPrEx>
-          <w:tblCellMar>
-            <w:top w:w="0" w:type="dxa"/>
-            <w:bottom w:w="0" w:type="dxa"/>
-          </w:tblCellMar>
-        </w:tblPrEx>
         <w:trPr>
           <w:cantSplit/>
           <w:trHeight w:val="576"/>
@@ -9885,12 +9347,6 @@
         </w:tc>
       </w:tr>
       <w:tr>
-        <w:tblPrEx>
-          <w:tblCellMar>
-            <w:top w:w="0" w:type="dxa"/>
-            <w:bottom w:w="0" w:type="dxa"/>
-          </w:tblCellMar>
-        </w:tblPrEx>
         <w:trPr>
           <w:cantSplit/>
           <w:trHeight w:val="576"/>
@@ -9954,12 +9410,6 @@
         </w:tc>
       </w:tr>
       <w:tr>
-        <w:tblPrEx>
-          <w:tblCellMar>
-            <w:top w:w="0" w:type="dxa"/>
-            <w:bottom w:w="0" w:type="dxa"/>
-          </w:tblCellMar>
-        </w:tblPrEx>
         <w:trPr>
           <w:cantSplit/>
           <w:trHeight w:val="576"/>
@@ -10110,12 +9560,6 @@
         <w:gridCol w:w="5487"/>
       </w:tblGrid>
       <w:tr>
-        <w:tblPrEx>
-          <w:tblCellMar>
-            <w:top w:w="0" w:type="dxa"/>
-            <w:bottom w:w="0" w:type="dxa"/>
-          </w:tblCellMar>
-        </w:tblPrEx>
         <w:trPr>
           <w:cantSplit/>
           <w:trHeight w:val="720"/>
@@ -10163,12 +9607,6 @@
         </w:tc>
       </w:tr>
       <w:tr>
-        <w:tblPrEx>
-          <w:tblCellMar>
-            <w:top w:w="0" w:type="dxa"/>
-            <w:bottom w:w="0" w:type="dxa"/>
-          </w:tblCellMar>
-        </w:tblPrEx>
         <w:trPr>
           <w:cantSplit/>
           <w:trHeight w:val="576"/>
@@ -10220,12 +9658,6 @@
         </w:tc>
       </w:tr>
       <w:tr>
-        <w:tblPrEx>
-          <w:tblCellMar>
-            <w:top w:w="0" w:type="dxa"/>
-            <w:bottom w:w="0" w:type="dxa"/>
-          </w:tblCellMar>
-        </w:tblPrEx>
         <w:trPr>
           <w:cantSplit/>
           <w:trHeight w:val="576"/>
@@ -10277,12 +9709,6 @@
         </w:tc>
       </w:tr>
       <w:tr>
-        <w:tblPrEx>
-          <w:tblCellMar>
-            <w:top w:w="0" w:type="dxa"/>
-            <w:bottom w:w="0" w:type="dxa"/>
-          </w:tblCellMar>
-        </w:tblPrEx>
         <w:trPr>
           <w:cantSplit/>
           <w:trHeight w:val="576"/>
@@ -10334,12 +9760,6 @@
         </w:tc>
       </w:tr>
       <w:tr>
-        <w:tblPrEx>
-          <w:tblCellMar>
-            <w:top w:w="0" w:type="dxa"/>
-            <w:bottom w:w="0" w:type="dxa"/>
-          </w:tblCellMar>
-        </w:tblPrEx>
         <w:trPr>
           <w:cantSplit/>
           <w:trHeight w:val="576"/>
@@ -10391,12 +9811,6 @@
         </w:tc>
       </w:tr>
       <w:tr>
-        <w:tblPrEx>
-          <w:tblCellMar>
-            <w:top w:w="0" w:type="dxa"/>
-            <w:bottom w:w="0" w:type="dxa"/>
-          </w:tblCellMar>
-        </w:tblPrEx>
         <w:trPr>
           <w:cantSplit/>
           <w:trHeight w:val="576"/>
@@ -10448,12 +9862,6 @@
         </w:tc>
       </w:tr>
       <w:tr>
-        <w:tblPrEx>
-          <w:tblCellMar>
-            <w:top w:w="0" w:type="dxa"/>
-            <w:bottom w:w="0" w:type="dxa"/>
-          </w:tblCellMar>
-        </w:tblPrEx>
         <w:trPr>
           <w:cantSplit/>
           <w:trHeight w:val="576"/>
@@ -10505,12 +9913,6 @@
         </w:tc>
       </w:tr>
       <w:tr>
-        <w:tblPrEx>
-          <w:tblCellMar>
-            <w:top w:w="0" w:type="dxa"/>
-            <w:bottom w:w="0" w:type="dxa"/>
-          </w:tblCellMar>
-        </w:tblPrEx>
         <w:trPr>
           <w:cantSplit/>
           <w:trHeight w:val="576"/>
@@ -10917,12 +10319,6 @@
         <w:gridCol w:w="5751"/>
       </w:tblGrid>
       <w:tr>
-        <w:tblPrEx>
-          <w:tblCellMar>
-            <w:top w:w="0" w:type="dxa"/>
-            <w:bottom w:w="0" w:type="dxa"/>
-          </w:tblCellMar>
-        </w:tblPrEx>
         <w:trPr>
           <w:cantSplit/>
           <w:trHeight w:val="720"/>
@@ -10971,12 +10367,6 @@
         </w:tc>
       </w:tr>
       <w:tr>
-        <w:tblPrEx>
-          <w:tblCellMar>
-            <w:top w:w="0" w:type="dxa"/>
-            <w:bottom w:w="0" w:type="dxa"/>
-          </w:tblCellMar>
-        </w:tblPrEx>
         <w:trPr>
           <w:cantSplit/>
           <w:trHeight w:val="576"/>
@@ -11050,12 +10440,6 @@
         </w:tc>
       </w:tr>
       <w:tr>
-        <w:tblPrEx>
-          <w:tblCellMar>
-            <w:top w:w="0" w:type="dxa"/>
-            <w:bottom w:w="0" w:type="dxa"/>
-          </w:tblCellMar>
-        </w:tblPrEx>
         <w:trPr>
           <w:cantSplit/>
           <w:trHeight w:val="576"/>
@@ -11107,12 +10491,6 @@
         </w:tc>
       </w:tr>
       <w:tr>
-        <w:tblPrEx>
-          <w:tblCellMar>
-            <w:top w:w="0" w:type="dxa"/>
-            <w:bottom w:w="0" w:type="dxa"/>
-          </w:tblCellMar>
-        </w:tblPrEx>
         <w:trPr>
           <w:cantSplit/>
           <w:trHeight w:val="576"/>
@@ -11164,12 +10542,6 @@
         </w:tc>
       </w:tr>
       <w:tr>
-        <w:tblPrEx>
-          <w:tblCellMar>
-            <w:top w:w="0" w:type="dxa"/>
-            <w:bottom w:w="0" w:type="dxa"/>
-          </w:tblCellMar>
-        </w:tblPrEx>
         <w:trPr>
           <w:cantSplit/>
           <w:trHeight w:val="576"/>
@@ -11221,12 +10593,6 @@
         </w:tc>
       </w:tr>
       <w:tr>
-        <w:tblPrEx>
-          <w:tblCellMar>
-            <w:top w:w="0" w:type="dxa"/>
-            <w:bottom w:w="0" w:type="dxa"/>
-          </w:tblCellMar>
-        </w:tblPrEx>
         <w:trPr>
           <w:cantSplit/>
           <w:trHeight w:val="576"/>
@@ -11278,12 +10644,6 @@
         </w:tc>
       </w:tr>
       <w:tr>
-        <w:tblPrEx>
-          <w:tblCellMar>
-            <w:top w:w="0" w:type="dxa"/>
-            <w:bottom w:w="0" w:type="dxa"/>
-          </w:tblCellMar>
-        </w:tblPrEx>
         <w:trPr>
           <w:cantSplit/>
           <w:trHeight w:val="576"/>
@@ -11337,12 +10697,6 @@
         </w:tc>
       </w:tr>
       <w:tr>
-        <w:tblPrEx>
-          <w:tblCellMar>
-            <w:top w:w="0" w:type="dxa"/>
-            <w:bottom w:w="0" w:type="dxa"/>
-          </w:tblCellMar>
-        </w:tblPrEx>
         <w:trPr>
           <w:cantSplit/>
           <w:trHeight w:val="576"/>
@@ -11402,12 +10756,6 @@
         </w:tc>
       </w:tr>
       <w:tr>
-        <w:tblPrEx>
-          <w:tblCellMar>
-            <w:top w:w="0" w:type="dxa"/>
-            <w:bottom w:w="0" w:type="dxa"/>
-          </w:tblCellMar>
-        </w:tblPrEx>
         <w:trPr>
           <w:cantSplit/>
           <w:trHeight w:val="576"/>
@@ -11467,12 +10815,6 @@
         </w:tc>
       </w:tr>
       <w:tr>
-        <w:tblPrEx>
-          <w:tblCellMar>
-            <w:top w:w="0" w:type="dxa"/>
-            <w:bottom w:w="0" w:type="dxa"/>
-          </w:tblCellMar>
-        </w:tblPrEx>
         <w:trPr>
           <w:cantSplit/>
           <w:trHeight w:val="576"/>
@@ -11532,12 +10874,6 @@
         </w:tc>
       </w:tr>
       <w:tr>
-        <w:tblPrEx>
-          <w:tblCellMar>
-            <w:top w:w="0" w:type="dxa"/>
-            <w:bottom w:w="0" w:type="dxa"/>
-          </w:tblCellMar>
-        </w:tblPrEx>
         <w:trPr>
           <w:cantSplit/>
           <w:trHeight w:val="576"/>
@@ -11829,12 +11165,6 @@
         <w:gridCol w:w="7050"/>
       </w:tblGrid>
       <w:tr>
-        <w:tblPrEx>
-          <w:tblCellMar>
-            <w:top w:w="0" w:type="dxa"/>
-            <w:bottom w:w="0" w:type="dxa"/>
-          </w:tblCellMar>
-        </w:tblPrEx>
         <w:trPr>
           <w:cantSplit/>
           <w:trHeight w:val="720"/>
@@ -11882,12 +11212,6 @@
         </w:tc>
       </w:tr>
       <w:tr>
-        <w:tblPrEx>
-          <w:tblCellMar>
-            <w:top w:w="0" w:type="dxa"/>
-            <w:bottom w:w="0" w:type="dxa"/>
-          </w:tblCellMar>
-        </w:tblPrEx>
         <w:trPr>
           <w:cantSplit/>
           <w:trHeight w:val="576"/>
@@ -11934,12 +11258,6 @@
         </w:tc>
       </w:tr>
       <w:tr>
-        <w:tblPrEx>
-          <w:tblCellMar>
-            <w:top w:w="0" w:type="dxa"/>
-            <w:bottom w:w="0" w:type="dxa"/>
-          </w:tblCellMar>
-        </w:tblPrEx>
         <w:trPr>
           <w:cantSplit/>
           <w:trHeight w:val="576"/>
@@ -11986,12 +11304,6 @@
         </w:tc>
       </w:tr>
       <w:tr>
-        <w:tblPrEx>
-          <w:tblCellMar>
-            <w:top w:w="0" w:type="dxa"/>
-            <w:bottom w:w="0" w:type="dxa"/>
-          </w:tblCellMar>
-        </w:tblPrEx>
         <w:trPr>
           <w:cantSplit/>
           <w:trHeight w:val="576"/>
@@ -12142,12 +11454,6 @@
         <w:gridCol w:w="7236"/>
       </w:tblGrid>
       <w:tr>
-        <w:tblPrEx>
-          <w:tblCellMar>
-            <w:top w:w="0" w:type="dxa"/>
-            <w:bottom w:w="0" w:type="dxa"/>
-          </w:tblCellMar>
-        </w:tblPrEx>
         <w:trPr>
           <w:cantSplit/>
           <w:trHeight w:val="720"/>
@@ -12195,12 +11501,6 @@
         </w:tc>
       </w:tr>
       <w:tr>
-        <w:tblPrEx>
-          <w:tblCellMar>
-            <w:top w:w="0" w:type="dxa"/>
-            <w:bottom w:w="0" w:type="dxa"/>
-          </w:tblCellMar>
-        </w:tblPrEx>
         <w:trPr>
           <w:cantSplit/>
           <w:trHeight w:val="576"/>
@@ -12247,12 +11547,6 @@
         </w:tc>
       </w:tr>
       <w:tr>
-        <w:tblPrEx>
-          <w:tblCellMar>
-            <w:top w:w="0" w:type="dxa"/>
-            <w:bottom w:w="0" w:type="dxa"/>
-          </w:tblCellMar>
-        </w:tblPrEx>
         <w:trPr>
           <w:cantSplit/>
           <w:trHeight w:val="576"/>
@@ -12299,12 +11593,6 @@
         </w:tc>
       </w:tr>
       <w:tr>
-        <w:tblPrEx>
-          <w:tblCellMar>
-            <w:top w:w="0" w:type="dxa"/>
-            <w:bottom w:w="0" w:type="dxa"/>
-          </w:tblCellMar>
-        </w:tblPrEx>
         <w:trPr>
           <w:cantSplit/>
           <w:trHeight w:val="576"/>
@@ -12351,12 +11639,6 @@
         </w:tc>
       </w:tr>
       <w:tr>
-        <w:tblPrEx>
-          <w:tblCellMar>
-            <w:top w:w="0" w:type="dxa"/>
-            <w:bottom w:w="0" w:type="dxa"/>
-          </w:tblCellMar>
-        </w:tblPrEx>
         <w:trPr>
           <w:cantSplit/>
           <w:trHeight w:val="576"/>
@@ -12403,12 +11685,6 @@
         </w:tc>
       </w:tr>
       <w:tr>
-        <w:tblPrEx>
-          <w:tblCellMar>
-            <w:top w:w="0" w:type="dxa"/>
-            <w:bottom w:w="0" w:type="dxa"/>
-          </w:tblCellMar>
-        </w:tblPrEx>
         <w:trPr>
           <w:cantSplit/>
           <w:trHeight w:val="576"/>
@@ -12455,12 +11731,6 @@
         </w:tc>
       </w:tr>
       <w:tr>
-        <w:tblPrEx>
-          <w:tblCellMar>
-            <w:top w:w="0" w:type="dxa"/>
-            <w:bottom w:w="0" w:type="dxa"/>
-          </w:tblCellMar>
-        </w:tblPrEx>
         <w:trPr>
           <w:cantSplit/>
           <w:trHeight w:val="576"/>
@@ -12507,12 +11777,6 @@
         </w:tc>
       </w:tr>
       <w:tr>
-        <w:tblPrEx>
-          <w:tblCellMar>
-            <w:top w:w="0" w:type="dxa"/>
-            <w:bottom w:w="0" w:type="dxa"/>
-          </w:tblCellMar>
-        </w:tblPrEx>
         <w:trPr>
           <w:cantSplit/>
           <w:trHeight w:val="576"/>
@@ -12608,12 +11872,6 @@
         <w:gridCol w:w="8024"/>
       </w:tblGrid>
       <w:tr>
-        <w:tblPrEx>
-          <w:tblCellMar>
-            <w:top w:w="0" w:type="dxa"/>
-            <w:bottom w:w="0" w:type="dxa"/>
-          </w:tblCellMar>
-        </w:tblPrEx>
         <w:trPr>
           <w:cantSplit/>
           <w:trHeight w:val="720"/>
@@ -12661,12 +11919,6 @@
         </w:tc>
       </w:tr>
       <w:tr>
-        <w:tblPrEx>
-          <w:tblCellMar>
-            <w:top w:w="0" w:type="dxa"/>
-            <w:bottom w:w="0" w:type="dxa"/>
-          </w:tblCellMar>
-        </w:tblPrEx>
         <w:trPr>
           <w:cantSplit/>
           <w:trHeight w:val="576"/>
@@ -12724,12 +11976,6 @@
         </w:tc>
       </w:tr>
       <w:tr>
-        <w:tblPrEx>
-          <w:tblCellMar>
-            <w:top w:w="0" w:type="dxa"/>
-            <w:bottom w:w="0" w:type="dxa"/>
-          </w:tblCellMar>
-        </w:tblPrEx>
         <w:trPr>
           <w:cantSplit/>
           <w:trHeight w:val="576"/>
@@ -12796,12 +12042,6 @@
         </w:tc>
       </w:tr>
       <w:tr>
-        <w:tblPrEx>
-          <w:tblCellMar>
-            <w:top w:w="0" w:type="dxa"/>
-            <w:bottom w:w="0" w:type="dxa"/>
-          </w:tblCellMar>
-        </w:tblPrEx>
         <w:trPr>
           <w:cantSplit/>
           <w:trHeight w:val="576"/>
@@ -12868,12 +12108,6 @@
         </w:tc>
       </w:tr>
       <w:tr>
-        <w:tblPrEx>
-          <w:tblCellMar>
-            <w:top w:w="0" w:type="dxa"/>
-            <w:bottom w:w="0" w:type="dxa"/>
-          </w:tblCellMar>
-        </w:tblPrEx>
         <w:trPr>
           <w:cantSplit/>
           <w:trHeight w:val="576"/>
@@ -12940,12 +12174,6 @@
         </w:tc>
       </w:tr>
       <w:tr>
-        <w:tblPrEx>
-          <w:tblCellMar>
-            <w:top w:w="0" w:type="dxa"/>
-            <w:bottom w:w="0" w:type="dxa"/>
-          </w:tblCellMar>
-        </w:tblPrEx>
         <w:trPr>
           <w:cantSplit/>
           <w:trHeight w:val="576"/>
@@ -12992,12 +12220,6 @@
         </w:tc>
       </w:tr>
       <w:tr>
-        <w:tblPrEx>
-          <w:tblCellMar>
-            <w:top w:w="0" w:type="dxa"/>
-            <w:bottom w:w="0" w:type="dxa"/>
-          </w:tblCellMar>
-        </w:tblPrEx>
         <w:trPr>
           <w:cantSplit/>
           <w:trHeight w:val="576"/>
@@ -13044,12 +12266,6 @@
         </w:tc>
       </w:tr>
       <w:tr>
-        <w:tblPrEx>
-          <w:tblCellMar>
-            <w:top w:w="0" w:type="dxa"/>
-            <w:bottom w:w="0" w:type="dxa"/>
-          </w:tblCellMar>
-        </w:tblPrEx>
         <w:trPr>
           <w:cantSplit/>
           <w:trHeight w:val="576"/>
@@ -13096,12 +12312,6 @@
         </w:tc>
       </w:tr>
       <w:tr>
-        <w:tblPrEx>
-          <w:tblCellMar>
-            <w:top w:w="0" w:type="dxa"/>
-            <w:bottom w:w="0" w:type="dxa"/>
-          </w:tblCellMar>
-        </w:tblPrEx>
         <w:trPr>
           <w:cantSplit/>
           <w:trHeight w:val="576"/>
@@ -13148,12 +12358,6 @@
         </w:tc>
       </w:tr>
       <w:tr>
-        <w:tblPrEx>
-          <w:tblCellMar>
-            <w:top w:w="0" w:type="dxa"/>
-            <w:bottom w:w="0" w:type="dxa"/>
-          </w:tblCellMar>
-        </w:tblPrEx>
         <w:trPr>
           <w:cantSplit/>
           <w:trHeight w:val="576"/>
@@ -13200,12 +12404,6 @@
         </w:tc>
       </w:tr>
       <w:tr>
-        <w:tblPrEx>
-          <w:tblCellMar>
-            <w:top w:w="0" w:type="dxa"/>
-            <w:bottom w:w="0" w:type="dxa"/>
-          </w:tblCellMar>
-        </w:tblPrEx>
         <w:trPr>
           <w:cantSplit/>
           <w:trHeight w:val="576"/>
@@ -13287,12 +12485,6 @@
         <w:gridCol w:w="3287"/>
       </w:tblGrid>
       <w:tr>
-        <w:tblPrEx>
-          <w:tblCellMar>
-            <w:top w:w="0" w:type="dxa"/>
-            <w:bottom w:w="0" w:type="dxa"/>
-          </w:tblCellMar>
-        </w:tblPrEx>
         <w:trPr>
           <w:cantSplit/>
           <w:trHeight w:val="720"/>
@@ -13360,12 +12552,6 @@
         </w:tc>
       </w:tr>
       <w:tr>
-        <w:tblPrEx>
-          <w:tblCellMar>
-            <w:top w:w="0" w:type="dxa"/>
-            <w:bottom w:w="0" w:type="dxa"/>
-          </w:tblCellMar>
-        </w:tblPrEx>
         <w:trPr>
           <w:cantSplit/>
           <w:trHeight w:val="576"/>
@@ -13465,12 +12651,6 @@
         </w:tc>
       </w:tr>
       <w:tr>
-        <w:tblPrEx>
-          <w:tblCellMar>
-            <w:top w:w="0" w:type="dxa"/>
-            <w:bottom w:w="0" w:type="dxa"/>
-          </w:tblCellMar>
-        </w:tblPrEx>
         <w:trPr>
           <w:cantSplit/>
           <w:trHeight w:val="576"/>
@@ -13570,12 +12750,6 @@
         </w:tc>
       </w:tr>
       <w:tr>
-        <w:tblPrEx>
-          <w:tblCellMar>
-            <w:top w:w="0" w:type="dxa"/>
-            <w:bottom w:w="0" w:type="dxa"/>
-          </w:tblCellMar>
-        </w:tblPrEx>
         <w:trPr>
           <w:cantSplit/>
           <w:trHeight w:val="576"/>
@@ -13659,12 +12833,6 @@
         </w:tc>
       </w:tr>
       <w:tr>
-        <w:tblPrEx>
-          <w:tblCellMar>
-            <w:top w:w="0" w:type="dxa"/>
-            <w:bottom w:w="0" w:type="dxa"/>
-          </w:tblCellMar>
-        </w:tblPrEx>
         <w:trPr>
           <w:cantSplit/>
           <w:trHeight w:val="576"/>
@@ -13743,12 +12911,6 @@
         </w:tc>
       </w:tr>
       <w:tr>
-        <w:tblPrEx>
-          <w:tblCellMar>
-            <w:top w:w="0" w:type="dxa"/>
-            <w:bottom w:w="0" w:type="dxa"/>
-          </w:tblCellMar>
-        </w:tblPrEx>
         <w:trPr>
           <w:cantSplit/>
           <w:trHeight w:val="576"/>
@@ -13823,12 +12985,6 @@
         </w:tc>
       </w:tr>
       <w:tr>
-        <w:tblPrEx>
-          <w:tblCellMar>
-            <w:top w:w="0" w:type="dxa"/>
-            <w:bottom w:w="0" w:type="dxa"/>
-          </w:tblCellMar>
-        </w:tblPrEx>
         <w:trPr>
           <w:cantSplit/>
           <w:trHeight w:val="576"/>
@@ -13903,12 +13059,6 @@
         </w:tc>
       </w:tr>
       <w:tr>
-        <w:tblPrEx>
-          <w:tblCellMar>
-            <w:top w:w="0" w:type="dxa"/>
-            <w:bottom w:w="0" w:type="dxa"/>
-          </w:tblCellMar>
-        </w:tblPrEx>
         <w:trPr>
           <w:cantSplit/>
           <w:trHeight w:val="576"/>
@@ -14045,12 +13195,6 @@
         <w:gridCol w:w="3134"/>
       </w:tblGrid>
       <w:tr>
-        <w:tblPrEx>
-          <w:tblCellMar>
-            <w:top w:w="0" w:type="dxa"/>
-            <w:bottom w:w="0" w:type="dxa"/>
-          </w:tblCellMar>
-        </w:tblPrEx>
         <w:trPr>
           <w:cantSplit/>
           <w:trHeight w:val="720"/>
@@ -14098,12 +13242,6 @@
         </w:tc>
       </w:tr>
       <w:tr>
-        <w:tblPrEx>
-          <w:tblCellMar>
-            <w:top w:w="0" w:type="dxa"/>
-            <w:bottom w:w="0" w:type="dxa"/>
-          </w:tblCellMar>
-        </w:tblPrEx>
         <w:trPr>
           <w:cantSplit/>
           <w:trHeight w:val="576"/>
@@ -14150,12 +13288,6 @@
         </w:tc>
       </w:tr>
       <w:tr>
-        <w:tblPrEx>
-          <w:tblCellMar>
-            <w:top w:w="0" w:type="dxa"/>
-            <w:bottom w:w="0" w:type="dxa"/>
-          </w:tblCellMar>
-        </w:tblPrEx>
         <w:trPr>
           <w:cantSplit/>
           <w:trHeight w:val="576"/>
@@ -14202,12 +13334,6 @@
         </w:tc>
       </w:tr>
       <w:tr>
-        <w:tblPrEx>
-          <w:tblCellMar>
-            <w:top w:w="0" w:type="dxa"/>
-            <w:bottom w:w="0" w:type="dxa"/>
-          </w:tblCellMar>
-        </w:tblPrEx>
         <w:trPr>
           <w:cantSplit/>
           <w:trHeight w:val="576"/>
@@ -14254,12 +13380,6 @@
         </w:tc>
       </w:tr>
       <w:tr>
-        <w:tblPrEx>
-          <w:tblCellMar>
-            <w:top w:w="0" w:type="dxa"/>
-            <w:bottom w:w="0" w:type="dxa"/>
-          </w:tblCellMar>
-        </w:tblPrEx>
         <w:trPr>
           <w:cantSplit/>
           <w:trHeight w:val="576"/>
@@ -14306,12 +13426,6 @@
         </w:tc>
       </w:tr>
       <w:tr>
-        <w:tblPrEx>
-          <w:tblCellMar>
-            <w:top w:w="0" w:type="dxa"/>
-            <w:bottom w:w="0" w:type="dxa"/>
-          </w:tblCellMar>
-        </w:tblPrEx>
         <w:trPr>
           <w:cantSplit/>
           <w:trHeight w:val="576"/>
@@ -14358,12 +13472,6 @@
         </w:tc>
       </w:tr>
       <w:tr>
-        <w:tblPrEx>
-          <w:tblCellMar>
-            <w:top w:w="0" w:type="dxa"/>
-            <w:bottom w:w="0" w:type="dxa"/>
-          </w:tblCellMar>
-        </w:tblPrEx>
         <w:trPr>
           <w:cantSplit/>
           <w:trHeight w:val="576"/>
@@ -14418,12 +13526,6 @@
         </w:tc>
       </w:tr>
       <w:tr>
-        <w:tblPrEx>
-          <w:tblCellMar>
-            <w:top w:w="0" w:type="dxa"/>
-            <w:bottom w:w="0" w:type="dxa"/>
-          </w:tblCellMar>
-        </w:tblPrEx>
         <w:trPr>
           <w:cantSplit/>
           <w:trHeight w:val="576"/>
@@ -14510,12 +13612,6 @@
         <w:gridCol w:w="6961"/>
       </w:tblGrid>
       <w:tr>
-        <w:tblPrEx>
-          <w:tblCellMar>
-            <w:top w:w="0" w:type="dxa"/>
-            <w:bottom w:w="0" w:type="dxa"/>
-          </w:tblCellMar>
-        </w:tblPrEx>
         <w:trPr>
           <w:cantSplit/>
           <w:trHeight w:val="720"/>
@@ -14563,12 +13659,6 @@
         </w:tc>
       </w:tr>
       <w:tr>
-        <w:tblPrEx>
-          <w:tblCellMar>
-            <w:top w:w="0" w:type="dxa"/>
-            <w:bottom w:w="0" w:type="dxa"/>
-          </w:tblCellMar>
-        </w:tblPrEx>
         <w:trPr>
           <w:cantSplit/>
           <w:trHeight w:val="576"/>
@@ -14626,12 +13716,6 @@
         </w:tc>
       </w:tr>
       <w:tr>
-        <w:tblPrEx>
-          <w:tblCellMar>
-            <w:top w:w="0" w:type="dxa"/>
-            <w:bottom w:w="0" w:type="dxa"/>
-          </w:tblCellMar>
-        </w:tblPrEx>
         <w:trPr>
           <w:cantSplit/>
           <w:trHeight w:val="576"/>
@@ -14711,12 +13795,6 @@
         </w:tc>
       </w:tr>
       <w:tr>
-        <w:tblPrEx>
-          <w:tblCellMar>
-            <w:top w:w="0" w:type="dxa"/>
-            <w:bottom w:w="0" w:type="dxa"/>
-          </w:tblCellMar>
-        </w:tblPrEx>
         <w:trPr>
           <w:cantSplit/>
           <w:trHeight w:val="576"/>
@@ -14796,12 +13874,6 @@
         </w:tc>
       </w:tr>
       <w:tr>
-        <w:tblPrEx>
-          <w:tblCellMar>
-            <w:top w:w="0" w:type="dxa"/>
-            <w:bottom w:w="0" w:type="dxa"/>
-          </w:tblCellMar>
-        </w:tblPrEx>
         <w:trPr>
           <w:cantSplit/>
           <w:trHeight w:val="576"/>
@@ -14881,12 +13953,6 @@
         </w:tc>
       </w:tr>
       <w:tr>
-        <w:tblPrEx>
-          <w:tblCellMar>
-            <w:top w:w="0" w:type="dxa"/>
-            <w:bottom w:w="0" w:type="dxa"/>
-          </w:tblCellMar>
-        </w:tblPrEx>
         <w:trPr>
           <w:cantSplit/>
           <w:trHeight w:val="576"/>
@@ -14966,12 +14032,6 @@
         </w:tc>
       </w:tr>
       <w:tr>
-        <w:tblPrEx>
-          <w:tblCellMar>
-            <w:top w:w="0" w:type="dxa"/>
-            <w:bottom w:w="0" w:type="dxa"/>
-          </w:tblCellMar>
-        </w:tblPrEx>
         <w:trPr>
           <w:cantSplit/>
           <w:trHeight w:val="576"/>
@@ -15051,12 +14111,6 @@
         </w:tc>
       </w:tr>
       <w:tr>
-        <w:tblPrEx>
-          <w:tblCellMar>
-            <w:top w:w="0" w:type="dxa"/>
-            <w:bottom w:w="0" w:type="dxa"/>
-          </w:tblCellMar>
-        </w:tblPrEx>
         <w:trPr>
           <w:cantSplit/>
           <w:trHeight w:val="576"/>
@@ -15164,12 +14218,6 @@
         </w:tc>
       </w:tr>
       <w:tr>
-        <w:tblPrEx>
-          <w:tblCellMar>
-            <w:top w:w="0" w:type="dxa"/>
-            <w:bottom w:w="0" w:type="dxa"/>
-          </w:tblCellMar>
-        </w:tblPrEx>
         <w:trPr>
           <w:cantSplit/>
           <w:trHeight w:val="576"/>
@@ -15285,12 +14333,6 @@
         </w:tc>
       </w:tr>
       <w:tr>
-        <w:tblPrEx>
-          <w:tblCellMar>
-            <w:top w:w="0" w:type="dxa"/>
-            <w:bottom w:w="0" w:type="dxa"/>
-          </w:tblCellMar>
-        </w:tblPrEx>
         <w:trPr>
           <w:cantSplit/>
           <w:trHeight w:val="576"/>
@@ -16520,6 +15562,33 @@
     <w:unhideWhenUsed/>
     <w:qFormat/>
   </w:style>
+  <w:style w:type="paragraph" w:styleId="HTMLPreformatted">
+    <w:name w:val="HTML Preformatted"/>
+    <w:basedOn w:val="Normal"/>
+    <w:link w:val="HTMLPreformattedChar"/>
+    <w:uiPriority w:val="99"/>
+    <w:semiHidden/>
+    <w:unhideWhenUsed/>
+    <w:rsid w:val="006B5ED0"/>
+    <w:rPr>
+      <w:rFonts w:ascii="Consolas" w:hAnsi="Consolas"/>
+      <w:sz w:val="20"/>
+      <w:szCs w:val="20"/>
+    </w:rPr>
+  </w:style>
+  <w:style w:type="character" w:customStyle="1" w:styleId="HTMLPreformattedChar">
+    <w:name w:val="HTML Preformatted Char"/>
+    <w:basedOn w:val="DefaultParagraphFont"/>
+    <w:link w:val="HTMLPreformatted"/>
+    <w:uiPriority w:val="99"/>
+    <w:semiHidden/>
+    <w:rsid w:val="006B5ED0"/>
+    <w:rPr>
+      <w:rFonts w:ascii="Consolas" w:hAnsi="Consolas"/>
+      <w:sz w:val="20"/>
+      <w:szCs w:val="20"/>
+    </w:rPr>
+  </w:style>
 </w:styles>
 </file>
 

</xml_diff>